<commit_message>
Clarify Chapter 2 quiz plan and application decision
</commit_message>
<xml_diff>
--- a/second-placement/planning/chapter-2-marketing-plan/Chapter-2-Marketing-Plan-Teacher-Guide-v2.docx
+++ b/second-placement/planning/chapter-2-marketing-plan/Chapter-2-Marketing-Plan-Teacher-Guide-v2.docx
@@ -366,7 +366,7 @@
     </w:p>
     <w:p>
       <w:r>
-        <w:t>Before teaching: confirm the Chapter 2 PDF is available to students, the SBTE’s notes (if any), the Terms format/template, and any actual Teams review assignment. Local Chapter 2 textbook access is confirmed; current school posting and dates are not.</w:t>
+        <w:t>Before teaching: confirm the Chapter 2 PDF is available to students, the SBTE’s notes (if any), the Terms format/template, and any actual Teams review assignment. A Chapter 2 vocabulary quiz was planned on September 30; its date, scope, and mechanics are not confirmed. Local textbook access is confirmed; current school posting and dates are not.</w:t>
       </w:r>
     </w:p>
     <w:p>
@@ -2905,7 +2905,7 @@
               <w:rPr>
                 <w:sz w:val="20"/>
               </w:rPr>
-              <w:t>If Chapter 2 Terms/review are actually assigned, provide completion time. Otherwise use in-class matching and source-supported explanation. P. 27 does not print a separate Test Your Knowledge worksheet’s questions.</w:t>
+              <w:t>If Chapter 2 Terms/review are actually assigned, provide completion time. Otherwise use in-class matching and source-supported explanation. A vocabulary quiz is planned, but use its exact scope/date only when confirmed. P. 27 does not print a separate Test Your Knowledge worksheet’s questions.</w:t>
             </w:r>
           </w:p>
         </w:tc>
@@ -3029,7 +3029,7 @@
     </w:p>
     <w:p>
       <w:r>
-        <w:t>INTENDED LEARNING  Use Chapter 2 ideas in a source-connected situation while the SBTE decides the graded task.</w:t>
+        <w:t>INTENDED LEARNING  Use Chapter 2 ideas in a source-connected situation while the graded application remains to be selected and confirmed with the SBTE.</w:t>
       </w:r>
     </w:p>
     <w:tbl>
@@ -3235,7 +3235,7 @@
               <w:rPr>
                 <w:sz w:val="20"/>
               </w:rPr>
-              <w:t>Ungraded rehearsal: identify one internal and one external factor, a needed data source, and a possible measure—after students reread the case. If SBTE confirms an assignment, replace rehearsal with the authorized instructions and criteria.</w:t>
+              <w:t>Ungraded rehearsal: identify one internal and one external factor, a needed data source, and a possible measure—after students reread the case. If an application is confirmed with the SBTE, replace rehearsal with the authorized instructions and criteria.</w:t>
             </w:r>
           </w:p>
         </w:tc>
@@ -3662,7 +3662,7 @@
     </w:p>
     <w:p>
       <w:r>
-        <w:t>School/Teams state: Chapter 2 posting, notes, digital-card template, separate review worksheet, submission route, and actual dates. Instructional decisions: vocabulary quiz, review deadline, graded application, presentation/project, rubric, and test timing. Chapter 1 precedents are evidence of a process, not authorization for a Chapter 2 grade or deadline.</w:t>
+        <w:t>School/Teams state: Chapter 2 posting, notes, digital-card template, separate review worksheet, submission route, and actual dates. Planned: a Chapter 2 vocabulary quiz; its date, scope, Teams posting, and grading mechanics remain unconfirmed. Still to decide with the SBTE: review deadline, graded application, presentation/project, rubric, and test timing. Chapter 1 precedents are evidence of a process, not authorization for a Chapter 2 grade or deadline.</w:t>
       </w:r>
     </w:p>
     <w:p>

</xml_diff>